<commit_message>
Rebuild fridge voltage-drop doc as a troubleshooting_doc.py guide
Converts the existing DMC4101_Not_Cooling_Voltage_Drop research notes
into the same polished .md/.docx/.pdf format as the 27R guides, with
a YAML source of truth. Content is the same research (rated cutoff,
the two likely explanations, diagnostic steps, wire-gauge fixes, other
reported causes, sources) — just restructured into the reusable
template rather than prose, so it now has a print-ready PDF.
</commit_message>
<xml_diff>
--- a/Winnebago_View_2020D/Fridge/DMC4101_Not_Cooling_Voltage_Drop.docx
+++ b/Winnebago_View_2020D/Fridge/DMC4101_Not_Cooling_Voltage_Drop.docx
@@ -7,7 +7,15 @@
         <w:pStyle w:val="Title"/>
       </w:pPr>
       <w:r>
-        <w:t>Dometic DMC4101 Fridge — Warms Up Below ~13V</w:t>
+        <w:t>Fridge Warms Below ~13V: Troubleshooting</w:t>
+      </w:r>
+    </w:p>
+    <w:p>
+      <w:r>
+        <w:rPr>
+          <w:i/>
+        </w:rPr>
+        <w:t>Generated from `DMC4101_Not_Cooling_Voltage_Drop.yaml` via `troubleshooting_doc.py` — edit that file, not this one.</w:t>
       </w:r>
     </w:p>
     <w:p>
@@ -16,11 +24,30 @@
       </w:r>
     </w:p>
     <w:p>
+      <w:r>
+        <w:rPr>
+          <w:b/>
+        </w:rPr>
+        <w:t>What you need:</w:t>
+      </w:r>
+      <w:r>
+        <w:t xml:space="preserve"> multimeter, access to the fridge's power terminals, a way to watch battery voltage live while the compressor cycles on.</w:t>
+      </w:r>
+    </w:p>
+    <w:p>
+      <w:r>
+        <w:rPr>
+          <w:i/>
+        </w:rPr>
+        <w:t>13V is well above the fridge's own rated cutoff — this points at a wiring or battery-sag problem, not the fridge's protection circuit doing what it's designed to do.</w:t>
+      </w:r>
+    </w:p>
+    <w:p>
       <w:pPr>
         <w:pStyle w:val="Heading2"/>
       </w:pPr>
       <w:r>
-        <w:t>Why this doesn't match the fridge's rated cutoff</w:t>
+        <w:t>Part 1 — Why This Doesn't Match the Fridge's Rated Cutoff</w:t>
       </w:r>
     </w:p>
     <w:p>
@@ -43,7 +70,32 @@
         <w:t>10.5V</w:t>
       </w:r>
       <w:r>
-        <w:t>. A ~13V threshold for warming is well above that rated cutoff, which points toward a wiring/voltage-drop problem rather than the fridge's protection circuit behaving as designed at its documented limit.</w:t>
+        <w:t>. A ~13V threshold for warming is well above that rated cutoff.</w:t>
+      </w:r>
+    </w:p>
+    <w:p>
+      <w:r>
+        <w:t xml:space="preserve">Checked both the manual and the wider web for any feature where the fridge changes cooling level based on battery voltage: </w:t>
+      </w:r>
+      <w:r>
+        <w:rPr>
+          <w:b/>
+        </w:rPr>
+        <w:t>there isn't one on this model.</w:t>
+      </w:r>
+      <w:r>
+        <w:t xml:space="preserve"> Modes (Performance/Silent/ECO) are selected manually — nothing switches automatically based on voltage. The only voltage behavior documented is a hard binary cutoff: full operation above 10.5V, full stop below it. (A genuine 3-stage voltage-based battery-protection feature does exist at Dometic, but only on the separate CFX3 portable cooler line — it doesn't apply to the built-in DMC4101.)</w:t>
+      </w:r>
+    </w:p>
+    <w:p>
+      <w:r>
+        <w:rPr>
+          <w:b/>
+        </w:rPr>
+        <w:t>Conclusion:</w:t>
+      </w:r>
+      <w:r>
+        <w:t xml:space="preserve"> the ~13V warming symptom is more consistent with the unit repeatedly hitting its hard 10.5V cutoff — due to wiring drop or sag under compressor load — than with any documented adaptive-cooling behavior.</w:t>
       </w:r>
     </w:p>
     <w:p>
@@ -51,7 +103,12 @@
         <w:pStyle w:val="Heading2"/>
       </w:pPr>
       <w:r>
-        <w:t>Two likely explanations</w:t>
+        <w:t>Part 2 — Two Likely Explanations</w:t>
+      </w:r>
+    </w:p>
+    <w:p>
+      <w:r>
+        <w:t>Both produce the same symptom — a live voltage check while the compressor is running under load is what tells them apart.</w:t>
       </w:r>
     </w:p>
     <w:p>
@@ -59,37 +116,34 @@
         <w:pStyle w:val="Heading3"/>
       </w:pPr>
       <w:r>
-        <w:t>1. Voltage drop between the battery and the fridge itself</w:t>
+        <w:t>☐ 1. Voltage drop between the battery and the fridge itself — CHECK FIRST</w:t>
       </w:r>
     </w:p>
     <w:p>
+      <w:pPr>
+        <w:pStyle w:val="ListBullet"/>
+      </w:pPr>
       <w:r>
-        <w:t xml:space="preserve">The DMC4101 is rated for </w:t>
-      </w:r>
-      <w:r>
-        <w:rPr>
-          <w:b/>
-        </w:rPr>
-        <w:t>13A</w:t>
-      </w:r>
-      <w:r>
-        <w:t xml:space="preserve"> per the manufacturer nameplate (see DMC4101_Model_Specs_Purchase.md (DMC4101_Model_Specs_Purchase.md)), with higher inrush at compressor startup. Dometic ships the unit with a fairly thin 16-gauge power cable, and RV owners repeatedly report that on longer or thinner wire runs, the fridge's own terminals see meaningfully less voltage than what the battery monitor or panel shows — sometimes over a volt of difference under load.</w:t>
+        <w:t>The DMC4101 is rated for 13A, with higher inrush at compressor startup. Dometic ships the unit with a fairly thin 16-gauge power cable, and RV owners repeatedly report the fridge's own terminals seeing meaningfully less voltage than the battery monitor or panel shows — sometimes over a volt of difference under load.</w:t>
       </w:r>
     </w:p>
     <w:p>
+      <w:pPr>
+        <w:pStyle w:val="ListBullet"/>
+      </w:pPr>
       <w:r>
-        <w:t>That means the battery bank can read "13V" at the panel while the fridge itself is already sagging down near the 10.5V rated cutoff, tripping the low-voltage shutdown even though the coach's overall electrical readout looks fine.</w:t>
+        <w:t>That means the battery bank can read "13V" at the panel while the fridge itself is already sagging down near the 10.5V rated cutoff.</w:t>
       </w:r>
     </w:p>
     <w:p>
       <w:r>
         <w:rPr>
-          <w:b/>
+          <w:i/>
         </w:rPr>
-        <w:t>Diagnostic:</w:t>
+        <w:t>Why this matters:</w:t>
       </w:r>
       <w:r>
-        <w:t xml:space="preserve"> measure voltage directly at the fridge's power terminals (not just at the battery or panel) while the compressor is actually running, and compare it to the reading at the battery at the same moment. A meaningful gap (several tenths of a volt or more) confirms drop in the supply wiring.</w:t>
+        <w:t xml:space="preserve"> Diagnostic: measure voltage directly at the fridge's power terminals (not just the battery/panel) while the compressor is actually running, and compare to the battery reading at the same moment. A gap of several tenths of a volt or more confirms drop in the supply wiring.</w:t>
       </w:r>
     </w:p>
     <w:p>
@@ -97,32 +151,34 @@
         <w:pStyle w:val="Heading3"/>
       </w:pPr>
       <w:r>
-        <w:t>2. Voltage sag under load vs. resting voltage</w:t>
+        <w:t>☐ 2. Voltage sag under load vs. resting voltage</w:t>
       </w:r>
     </w:p>
     <w:p>
+      <w:pPr>
+        <w:pStyle w:val="ListBullet"/>
+      </w:pPr>
       <w:r>
-        <w:t xml:space="preserve">A battery bank can look fine at rest (13V+) but sag hard the instant the 13A compressor kicks on, especially if the battery is older, undersized for the load, or already partially discharged. That sag can be enough to trip the fridge's low-voltage protection, and the voltage bounces back once the compressor drops out — which reads externally as "it warms up whenever voltage dips below 13V," even though the </w:t>
+        <w:t>A battery bank can look fine at rest (13V+) but sag hard the instant the 13A compressor kicks on, especially if the battery is older, undersized for the load, or already partially discharged.</w:t>
       </w:r>
+    </w:p>
+    <w:p>
+      <w:pPr>
+        <w:pStyle w:val="ListBullet"/>
+      </w:pPr>
       <w:r>
-        <w:rPr>
-          <w:i/>
-        </w:rPr>
-        <w:t>resting</w:t>
-      </w:r>
-      <w:r>
-        <w:t xml:space="preserve"> voltage never looked alarming.</w:t>
+        <w:t>That sag can trip the fridge's low-voltage protection, then bounce back once the compressor drops out — externally this reads as "it warms up whenever voltage dips below 13V," even though the resting voltage never looked alarming.</w:t>
       </w:r>
     </w:p>
     <w:p>
       <w:r>
         <w:rPr>
-          <w:b/>
+          <w:i/>
         </w:rPr>
-        <w:t>Diagnostic:</w:t>
+        <w:t>Why this matters:</w:t>
       </w:r>
       <w:r>
-        <w:t xml:space="preserve"> watch battery voltage on a live meter/monitor at the exact moment the compressor cycles on, not just the resting reading beforehand.</w:t>
+        <w:t xml:space="preserve"> Diagnostic: watch battery voltage on a live meter/monitor at the exact moment the compressor cycles on, not just the resting reading beforehand.</w:t>
       </w:r>
     </w:p>
     <w:p>
@@ -130,13 +186,95 @@
         <w:pStyle w:val="Heading2"/>
       </w:pPr>
       <w:r>
-        <w:t>Fixes reported by other owners</w:t>
+        <w:t>Part 3 — Diagnostic Steps for This Coach</w:t>
+      </w:r>
+    </w:p>
+    <w:p>
+      <w:r>
+        <w:t>Work through in order — each result tells you where to look next.</w:t>
+      </w:r>
+    </w:p>
+    <w:p>
+      <w:pPr>
+        <w:pStyle w:val="Heading3"/>
+      </w:pPr>
+      <w:r>
+        <w:t>☐ 1. Measure at the fridge terminals under running load</w:t>
       </w:r>
     </w:p>
     <w:p>
       <w:pPr>
         <w:pStyle w:val="ListBullet"/>
       </w:pPr>
+      <w:r>
+        <w:t>Measure voltage at the fridge's own power terminals while the compressor is running, and compare to the panel/monitor reading at the same instant.</w:t>
+      </w:r>
+    </w:p>
+    <w:p>
+      <w:pPr>
+        <w:pStyle w:val="Heading3"/>
+      </w:pPr>
+      <w:r>
+        <w:t>☐ 2. If there's a significant gap: it's the wiring</w:t>
+      </w:r>
+    </w:p>
+    <w:p>
+      <w:pPr>
+        <w:pStyle w:val="ListBullet"/>
+      </w:pPr>
+      <w:r>
+        <w:t>Trace and inspect the fridge's power run for undersized wire, long runs, or corroded/loose connections.</w:t>
+      </w:r>
+    </w:p>
+    <w:p>
+      <w:pPr>
+        <w:pStyle w:val="ListBullet"/>
+      </w:pPr>
+      <w:r>
+        <w:t>Plan to rewire with 10–8 AWG if confirmed (see Part 4).</w:t>
+      </w:r>
+    </w:p>
+    <w:p>
+      <w:pPr>
+        <w:pStyle w:val="Heading3"/>
+      </w:pPr>
+      <w:r>
+        <w:t>☐ 3. If there's no significant gap: it's battery sag, not wiring</w:t>
+      </w:r>
+    </w:p>
+    <w:p>
+      <w:pPr>
+        <w:pStyle w:val="ListBullet"/>
+      </w:pPr>
+      <w:r>
+        <w:t>Fridge terminal voltage tracking the panel closely points at genuine battery sag under load — look at battery age/capacity and charging behavior instead of the wiring.</w:t>
+      </w:r>
+    </w:p>
+    <w:p>
+      <w:pPr>
+        <w:pStyle w:val="Heading3"/>
+      </w:pPr>
+      <w:r>
+        <w:t>☐ 4. If voltage checks out fine in both cases</w:t>
+      </w:r>
+    </w:p>
+    <w:p>
+      <w:pPr>
+        <w:pStyle w:val="ListBullet"/>
+      </w:pPr>
+      <w:r>
+        <w:t>Revisit the fan/control-board/sensor causes instead of the electrical supply — see Part 5.</w:t>
+      </w:r>
+    </w:p>
+    <w:p>
+      <w:pPr>
+        <w:pStyle w:val="Heading2"/>
+      </w:pPr>
+      <w:r>
+        <w:t>Part 4 — Fixes, If Wiring Is Confirmed as the Cause</w:t>
+      </w:r>
+    </w:p>
+    <w:p>
       <w:r>
         <w:rPr>
           <w:b/>
@@ -153,13 +291,10 @@
         <w:t>15A</w:t>
       </w:r>
       <w:r>
-        <w:t xml:space="preserve"> (per the nameplate — see DMC4101_Model_Specs_Purchase.md (DMC4101_Model_Specs_Purchase.md)) — rather than relying on the stock 16-gauge cable or a long factory run through the coach. Note the fuse rating (15A) is intentionally above the fridge's 13A running draw to allow for compressor startup inrush without nuisance-tripping; confirm the fuse matches the ampacity of whatever wire gauge is actually installed.</w:t>
+        <w:t xml:space="preserve"> (per the nameplate), rather than relying on the stock 16-gauge cable or a long factory run through the coach. The 15A fuse is intentionally above the fridge's 13A running draw to allow for compressor startup inrush without nuisance-tripping — confirm the fuse matches the ampacity of whatever wire gauge is actually installed.</w:t>
       </w:r>
     </w:p>
     <w:p>
-      <w:pPr>
-        <w:pStyle w:val="ListBullet"/>
-      </w:pPr>
       <w:r>
         <w:rPr>
           <w:b/>
@@ -167,239 +302,21 @@
         <w:t>Check/upgrade the battery bank</w:t>
       </w:r>
       <w:r>
-        <w:t xml:space="preserve"> if sag-under-load turns out to be the driver rather than wiring resistance — an aging or undersized battery bank will show exactly this symptom even with perfect wiring.</w:t>
-      </w:r>
-    </w:p>
-    <w:p>
-      <w:pPr>
-        <w:pStyle w:val="Heading2"/>
-      </w:pPr>
-      <w:r>
-        <w:t>Other commonly reported DMC4101 cooling issues (for reference, not yet confirmed as the cause here)</w:t>
-      </w:r>
-    </w:p>
-    <w:p>
-      <w:pPr>
-        <w:pStyle w:val="ListBullet"/>
-      </w:pPr>
-      <w:r>
-        <w:rPr>
-          <w:b/>
-        </w:rPr>
-        <w:t>Freezer fan motor failure</w:t>
-      </w:r>
-      <w:r>
-        <w:t xml:space="preserve"> — bearings dry out or the motor fails outright, so cold air never circulates from the freezer to the fridge compartment; freezer stays cold, fridge doesn't.</w:t>
-      </w:r>
-    </w:p>
-    <w:p>
-      <w:pPr>
-        <w:pStyle w:val="ListBullet"/>
-      </w:pPr>
-      <w:r>
-        <w:rPr>
-          <w:b/>
-        </w:rPr>
-        <w:t>Control board failure</w:t>
-      </w:r>
-      <w:r>
-        <w:t xml:space="preserve"> — less common, but reported, including at least one case of a </w:t>
-      </w:r>
-      <w:r>
-        <w:rPr>
-          <w:i/>
-        </w:rPr>
-        <w:t>replacement</w:t>
-      </w:r>
-      <w:r>
-        <w:t xml:space="preserve"> board failing again within days.</w:t>
-      </w:r>
-    </w:p>
-    <w:p>
-      <w:pPr>
-        <w:pStyle w:val="ListBullet"/>
-      </w:pPr>
-      <w:r>
-        <w:rPr>
-          <w:b/>
-        </w:rPr>
-        <w:t>Faulty/misreading temperature sensor</w:t>
-      </w:r>
-      <w:r>
-        <w:t xml:space="preserve"> — causes incorrect compressor cycling.</w:t>
-      </w:r>
-    </w:p>
-    <w:p>
-      <w:pPr>
-        <w:pStyle w:val="ListBullet"/>
-      </w:pPr>
-      <w:r>
-        <w:rPr>
-          <w:b/>
-        </w:rPr>
-        <w:t>Airflow damper/slider misadjustment</w:t>
-      </w:r>
-      <w:r>
-        <w:t xml:space="preserve"> — the freezer's internal temperature slider controls how much cold air is diverted to the fridge side; setting it to "Max" can starve the fridge compartment even though the freezer itself is fine.</w:t>
-      </w:r>
-    </w:p>
-    <w:p>
-      <w:pPr>
-        <w:pStyle w:val="ListBullet"/>
-      </w:pPr>
-      <w:r>
-        <w:rPr>
-          <w:b/>
-        </w:rPr>
-        <w:t>Blinking status light + full shutdown</w:t>
-      </w:r>
-      <w:r>
-        <w:t xml:space="preserve"> — several owners report the freezer fan stopping, a panel light blinking, then the unit shutting down entirely — consistent with a fan/board fault triggering a protective shutdown (distinct from the voltage-drop pattern above).</w:t>
-      </w:r>
-    </w:p>
-    <w:p>
-      <w:pPr>
-        <w:pStyle w:val="Heading2"/>
-      </w:pPr>
-      <w:r>
-        <w:t>Next steps for this coach</w:t>
+        <w:t xml:space="preserve"> if sag-under-load turns out to be the driver rather than wiring resistance — an aging or undersized battery bank shows exactly this symptom even with perfect wiring.</w:t>
       </w:r>
     </w:p>
     <w:p>
       <w:r>
-        <w:t>1. Measure voltage at the fridge's own terminals under running load, and compare to the panel/monitor reading at the same instant.</w:t>
-      </w:r>
-    </w:p>
-    <w:p>
-      <w:r>
-        <w:t>2. If there's a significant gap, trace and inspect the fridge's power run for undersized wire, long runs, or corroded/loose connections; plan to rewire with 10–8 AWG if confirmed.</w:t>
-      </w:r>
-    </w:p>
-    <w:p>
-      <w:r>
-        <w:t>3. If there's no significant gap (fridge terminal voltage tracks the panel closely), the issue is more likely genuine battery sag under load — look at battery age/capacity and charging behavior instead of the wiring.</w:t>
-      </w:r>
-    </w:p>
-    <w:p>
-      <w:r>
-        <w:t>4. If voltage checks out fine in both cases, revisit the fan/control-board/sensor causes above rather than the electrical supply.</w:t>
-      </w:r>
-    </w:p>
-    <w:p>
-      <w:pPr>
-        <w:pStyle w:val="Heading2"/>
-      </w:pPr>
-      <w:r>
-        <w:t>Appendix: Does the DMC4101 have dynamic voltage-based cooling adjustment?</w:t>
-      </w:r>
-    </w:p>
-    <w:p>
-      <w:r>
-        <w:t xml:space="preserve">Checked both the official manual and the wider web for any feature where the fridge changes cooling level or compressor speed automatically based on battery voltage. Short answer: </w:t>
+        <w:t xml:space="preserve">Manufacturer-recommended maximum wire run length by gauge, from the DMC4101/DMC4081 manual's Installation section (power supply requirement: </w:t>
       </w:r>
       <w:r>
         <w:rPr>
           <w:b/>
         </w:rPr>
-        <w:t>no, not on this model.</w:t>
-      </w:r>
-    </w:p>
-    <w:p>
-      <w:pPr>
-        <w:pStyle w:val="ListBullet"/>
-      </w:pPr>
-      <w:r>
-        <w:rPr>
-          <w:b/>
-        </w:rPr>
-        <w:t>Modes are manual, not voltage-triggered.</w:t>
+        <w:t>10.5–17.0 VDC, ≥15A</w:t>
       </w:r>
       <w:r>
-        <w:t xml:space="preserve"> The DMC4101 has three modes — Performance (AUTO, 5 temperature levels), Silent (compressor at constant speed, outer fan low speed, capped at level 3), and ECO (AUTO, capped at level 1) — all selected manually via the control panel's mode button. Nothing in the manual switches between them automatically, based on voltage or otherwise.</w:t>
-      </w:r>
-    </w:p>
-    <w:p>
-      <w:pPr>
-        <w:pStyle w:val="ListBullet"/>
-      </w:pPr>
-      <w:r>
-        <w:rPr>
-          <w:b/>
-        </w:rPr>
-        <w:t>The only voltage behavior documented is a hard binary cutoff</w:t>
-      </w:r>
-      <w:r>
-        <w:t xml:space="preserve">, stated once in the manual's Specifications section: </w:t>
-      </w:r>
-      <w:r>
-        <w:rPr>
-          <w:i/>
-        </w:rPr>
-        <w:t>"The compressor will stop running when the voltage is lower than 10.5V."</w:t>
-      </w:r>
-      <w:r>
-        <w:t xml:space="preserve"> Operating range is 10.5–17.0 VDC. There's no gradual derating, reduced compressor speed, or stepped-down cooling described as voltage drops — it's full operation above 10.5V, full stop below it. The official Troubleshooting table for "not cool enough" doesn't mention voltage at all (it lists blocked vents, poor ventilation, door left open, warm food just added, thermostat set too warm).</w:t>
-      </w:r>
-    </w:p>
-    <w:p>
-      <w:pPr>
-        <w:pStyle w:val="ListBullet"/>
-      </w:pPr>
-      <w:r>
-        <w:rPr>
-          <w:b/>
-        </w:rPr>
-        <w:t>"Variable speed compressor"</w:t>
-      </w:r>
-      <w:r>
-        <w:t xml:space="preserve"> (marketing language Dometic and third-party listings use for this model) refers to speed modulation for cooling demand/efficiency — the same way most modern compressor fridges work — not a voltage-responsive feature.</w:t>
-      </w:r>
-    </w:p>
-    <w:p>
-      <w:pPr>
-        <w:pStyle w:val="ListBullet"/>
-      </w:pPr>
-      <w:r>
-        <w:rPr>
-          <w:b/>
-        </w:rPr>
-        <w:t>A real 3-stage dynamic battery protection system does exist at Dometic — but on a different product line.</w:t>
-      </w:r>
-      <w:r>
-        <w:t xml:space="preserve"> The </w:t>
-      </w:r>
-      <w:r>
-        <w:rPr>
-          <w:b/>
-        </w:rPr>
-        <w:t>CFX3 portable cooler</w:t>
-      </w:r>
-      <w:r>
-        <w:t xml:space="preserve"> series has a genuine Low/Medium/High battery-protection setting that actively monitors DC voltage and cuts the cooler off at different thresholds depending on the setting and vehicle/dual-battery use case (one forum report cites ~11.2V on Medium with a button not depressed, ~12.2V with it depressed). This is a distinct product line from the built-in DMC series and does not apply to the DMC4101.</w:t>
-      </w:r>
-    </w:p>
-    <w:p>
-      <w:r>
-        <w:rPr>
-          <w:b/>
-        </w:rPr>
-        <w:t>Conclusion:</w:t>
-      </w:r>
-      <w:r>
-        <w:t xml:space="preserve"> nothing in Dometic's literature or in forum/marketing material supports a voltage-based dynamic cooling feature on the DMC4101. The ~13V warming symptom is more consistent with the unit repeatedly hitting its hard 10.5V cutoff (due to wiring drop or sag under compressor load) than with any documented adaptive-cooling behavior.</w:t>
-      </w:r>
-    </w:p>
-    <w:p>
-      <w:pPr>
-        <w:pStyle w:val="Heading2"/>
-      </w:pPr>
-      <w:r>
-        <w:t>Appendix: Manufacturer-recommended wire gauge (from the DMC4101/DMC4081 manual)</w:t>
-      </w:r>
-    </w:p>
-    <w:p>
-      <w:r>
-        <w:t>The manual's Installation section specifies maximum wire run length by gauge, for the refrigerator's 12V supply circuit:</w:t>
+        <w:t>):</w:t>
       </w:r>
     </w:p>
     <w:tbl>
@@ -546,17 +463,71 @@
       </w:tr>
     </w:tbl>
     <w:p>
+      <w:pPr>
+        <w:pStyle w:val="Heading2"/>
+      </w:pPr>
       <w:r>
-        <w:t xml:space="preserve">Power supply requirement per the manual: </w:t>
+        <w:t>Part 5 — If Voltage Checks Out Fine: Other Reported Causes</w:t>
       </w:r>
+    </w:p>
+    <w:p>
+      <w:r>
+        <w:t>Not yet confirmed as the cause on this coach, but commonly reported for this model — worth checking if both voltage diagnostics above come back clean:</w:t>
+      </w:r>
+    </w:p>
+    <w:p>
       <w:r>
         <w:rPr>
           <w:b/>
         </w:rPr>
-        <w:t>10.5–17.0 VDC, ≥15A.</w:t>
+        <w:t>Freezer fan motor failure</w:t>
       </w:r>
       <w:r>
-        <w:t xml:space="preserve"> Worth comparing this table against the actual wire gauge and run length installed to the fridge in this coach as part of the diagnostic in "Next steps" above.</w:t>
+        <w:t xml:space="preserve"> — bearings dry out or the motor fails outright, so cold air never circulates from the freezer to the fridge compartment; freezer stays cold, fridge doesn't.</w:t>
+      </w:r>
+    </w:p>
+    <w:p>
+      <w:r>
+        <w:rPr>
+          <w:b/>
+        </w:rPr>
+        <w:t>Control board failure</w:t>
+      </w:r>
+      <w:r>
+        <w:t xml:space="preserve"> — less common, but reported, including at least one case of a replacement board failing again within days.</w:t>
+      </w:r>
+    </w:p>
+    <w:p>
+      <w:r>
+        <w:rPr>
+          <w:b/>
+        </w:rPr>
+        <w:t>Faulty/misreading temperature sensor</w:t>
+      </w:r>
+      <w:r>
+        <w:t xml:space="preserve"> — causes incorrect compressor cycling.</w:t>
+      </w:r>
+    </w:p>
+    <w:p>
+      <w:r>
+        <w:rPr>
+          <w:b/>
+        </w:rPr>
+        <w:t>Airflow damper/slider misadjustment</w:t>
+      </w:r>
+      <w:r>
+        <w:t xml:space="preserve"> — the freezer's internal temperature slider controls how much cold air is diverted to the fridge side; setting it to "Max" can starve the fridge compartment even though the freezer itself is fine.</w:t>
+      </w:r>
+    </w:p>
+    <w:p>
+      <w:r>
+        <w:rPr>
+          <w:b/>
+        </w:rPr>
+        <w:t>Blinking status light + full shutdown</w:t>
+      </w:r>
+      <w:r>
+        <w:t xml:space="preserve"> — several owners report the freezer fan stopping, a panel light blinking, then the unit shutting down entirely — consistent with a fan/board fault triggering a protective shutdown (distinct from the voltage-drop pattern in Parts 1-2).</w:t>
       </w:r>
     </w:p>
     <w:p>
@@ -564,95 +535,70 @@
         <w:pStyle w:val="Heading2"/>
       </w:pPr>
       <w:r>
-        <w:t>Sources</w:t>
+        <w:t>— Sources</w:t>
       </w:r>
     </w:p>
     <w:p>
-      <w:pPr>
-        <w:pStyle w:val="ListBullet"/>
-      </w:pPr>
       <w:r>
         <w:t>Dometic DMC 4101/4081 Operation Manual (PDF) (https://forestriverinc.com/files/Component-Manuals/Appliance/Dometic%20-%20Refrigerator%20Model%20DMC4101,%20DMC4081%20Operation%20Manual.pdf)</w:t>
       </w:r>
     </w:p>
     <w:p>
-      <w:pPr>
-        <w:pStyle w:val="ListBullet"/>
-      </w:pPr>
       <w:r>
         <w:t>Suggestions for wiring up Dometic — Expedition Portal (https://expeditionportal.com/forum/threads/suggestions-for-wiring-up-dometic.174825/)</w:t>
       </w:r>
     </w:p>
     <w:p>
-      <w:pPr>
-        <w:pStyle w:val="ListBullet"/>
-      </w:pPr>
       <w:r>
         <w:t>Dometic 4101 fridge performance issues — iRV2 Forums (https://www.irv2.com/threads/dometic-4101-fridge-performance-issues.2204103/)</w:t>
       </w:r>
     </w:p>
     <w:p>
-      <w:pPr>
-        <w:pStyle w:val="ListBullet"/>
-      </w:pPr>
       <w:r>
         <w:t>Dometic DMC4101 12volt fridge won't work — iRV2 Forums (https://www.irv2.com/threads/dometic-dmc4101-12volt-fridge-wont-work.2013481/)</w:t>
       </w:r>
     </w:p>
     <w:p>
-      <w:pPr>
-        <w:pStyle w:val="ListBullet"/>
-      </w:pPr>
       <w:r>
         <w:t>Dometic 12v wiring question — Forest River Forums (https://www.forestriverforums.com/threads/dometic-12v-wiring-question.248665/)</w:t>
       </w:r>
     </w:p>
     <w:p>
-      <w:pPr>
-        <w:pStyle w:val="ListBullet"/>
-      </w:pPr>
       <w:r>
         <w:t>Dometic DMC4101 Freezer Not Freezing—Fan or Control Board Issue? — Escape RV Owners Forum (https://www.escapeforum.org/threads/dometic-dmc4101-freezer-not-freezing%E2%80%94fan-or-control-board-issue.2185851/)</w:t>
       </w:r>
     </w:p>
     <w:p>
-      <w:pPr>
-        <w:pStyle w:val="ListBullet"/>
-      </w:pPr>
       <w:r>
         <w:t>Dometic DMC4101 fridge portion not cooling — My Grand RV (https://www.mygrandrv.com/threads/dometic-dmc4101-fridge-portion-not-cooling.76990/)</w:t>
       </w:r>
     </w:p>
     <w:p>
-      <w:pPr>
-        <w:pStyle w:val="ListBullet"/>
-      </w:pPr>
       <w:r>
         <w:t>Dometic dmc4101 12vdc fridge not cooling and light blinking — Good Sam Community (https://community.goodsam.com/discussions/technicalissues/dometic-dmc4101-12vdc-fridge-not-cooling-and-light-blinking/3613689)</w:t>
       </w:r>
     </w:p>
     <w:p>
-      <w:pPr>
-        <w:pStyle w:val="ListBullet"/>
-      </w:pPr>
       <w:r>
         <w:t>Dometic Refrigerator Not Cooling — My Grand RV (https://www.mygrandrv.com/threads/dometic-refrigerator-not-cooling.67154/)</w:t>
       </w:r>
     </w:p>
     <w:p>
-      <w:pPr>
-        <w:pStyle w:val="ListBullet"/>
-      </w:pPr>
       <w:r>
         <w:t>Dometic refrigerator not cooling — iRV2 Forums (https://www.irv2.com/threads/dometic-refrigerator-not-cooling.2075994/)</w:t>
       </w:r>
     </w:p>
     <w:p>
-      <w:pPr>
-        <w:pStyle w:val="ListBullet"/>
-      </w:pPr>
       <w:r>
         <w:t>Dometic 12 v fridge — Forest River Forums (https://www.forestriverforums.com/threads/dometic-12-v-fridge.359179/)</w:t>
+      </w:r>
+    </w:p>
+    <w:p>
+      <w:r>
+        <w:rPr>
+          <w:i/>
+        </w:rPr>
+        <w:t>Companion documents: DMC4101_Manuals.md/.docx (what documentation Dometic does/doesn't publish for this model — local only) | DMC4101_Model_Specs_Purchase.md/.docx (nameplate specs and purchase record — local only) | DMC4101_DMC4081_Install_Operation_Manual.pdf (official manual, saved locally in the parent folder)</w:t>
       </w:r>
     </w:p>
     <w:sectPr>

</xml_diff>